<commit_message>
Safest choice right now
</commit_message>
<xml_diff>
--- a/trilingua-code/Model/translated_input.docx
+++ b/trilingua-code/Model/translated_input.docx
@@ -45,9 +45,7 @@
         <w:rPr>
           <w:rtl w:val="0"/>
         </w:rPr>
-        <w:t xml:space="preserve">Adunay 4 ka sangay nga adunay kini nga 4 isip panghunahuna: </w:t>
-        <w:br/>
-        <w:t>Maa (0968) 386 9235</w:t>
+        <w:t>Adunay 4 ka sanga nga kini nga 4 sa hunahuna: Maa (0968) 386 9235</w:t>
       </w:r>
     </w:p>
     <w:p>
@@ -101,28 +99,28 @@
         <w:rPr>
           <w:rtl w:val="0"/>
         </w:rPr>
-        <w:t>Gihulagway isip usa ka restawran base sa kategorya sa facebook page</w:t>
-      </w:r>
-    </w:p>
-    <w:p>
-      <w:pPr>
-        <w:rPr/>
-      </w:pPr>
-      <w:r>
-        <w:rPr>
-          <w:rtl w:val="0"/>
-        </w:rPr>
-      </w:r>
-    </w:p>
-    <w:p>
-      <w:pPr>
-        <w:rPr/>
-      </w:pPr>
-      <w:r>
-        <w:rPr>
-          <w:rtl w:val="0"/>
-        </w:rPr>
-        <w:t>Ang presyo giisip nga tunga-tunga</w:t>
+        <w:t>Giisip isip usa ka restawran base sa facebook page category</w:t>
+      </w:r>
+    </w:p>
+    <w:p>
+      <w:pPr>
+        <w:rPr/>
+      </w:pPr>
+      <w:r>
+        <w:rPr>
+          <w:rtl w:val="0"/>
+        </w:rPr>
+      </w:r>
+    </w:p>
+    <w:p>
+      <w:pPr>
+        <w:rPr/>
+      </w:pPr>
+      <w:r>
+        <w:rPr>
+          <w:rtl w:val="0"/>
+        </w:rPr>
+        <w:t>Ang presyo giisip nga tunga-tunga.</w:t>
       </w:r>
     </w:p>
     <w:p>
@@ -175,7 +173,7 @@
         <w:rPr>
           <w:rtl w:val="0"/>
         </w:rPr>
-        <w:t>Messenger</w:t>
+        <w:t>Mensahe</w:t>
       </w:r>
     </w:p>
     <w:p>
@@ -271,70 +269,70 @@
         <w:rPr>
           <w:rtl w:val="0"/>
         </w:rPr>
-        <w:t>Ang kasaligan nga fitness hub sa Bio Davao sukad 2000, dedikado sa kusog, kahimsog, ug komunidad.</w:t>
-      </w:r>
-    </w:p>
-    <w:p>
-      <w:pPr>
-        <w:rPr/>
-      </w:pPr>
-      <w:r>
-        <w:rPr>
-          <w:rtl w:val="0"/>
-        </w:rPr>
-      </w:r>
-    </w:p>
-    <w:p>
-      <w:pPr>
-        <w:rPr/>
-      </w:pPr>
-      <w:r>
-        <w:rPr>
-          <w:rtl w:val="0"/>
-        </w:rPr>
-        <w:t>Kategorya Gym/sentro sa pisikal nga kahimsog</w:t>
-      </w:r>
-    </w:p>
-    <w:p>
-      <w:pPr>
-        <w:rPr/>
-      </w:pPr>
-      <w:r>
-        <w:rPr>
-          <w:rtl w:val="0"/>
-        </w:rPr>
-      </w:r>
-    </w:p>
-    <w:p>
-      <w:pPr>
-        <w:rPr/>
-      </w:pPr>
-      <w:r>
-        <w:rPr>
-          <w:rtl w:val="0"/>
-        </w:rPr>
-        <w:t>Presyo range moderate</w:t>
-      </w:r>
-    </w:p>
-    <w:p>
-      <w:pPr>
-        <w:rPr/>
-      </w:pPr>
-      <w:r>
-        <w:rPr>
-          <w:rtl w:val="0"/>
-        </w:rPr>
-      </w:r>
-    </w:p>
-    <w:p>
-      <w:pPr>
-        <w:rPr/>
-      </w:pPr>
-      <w:r>
-        <w:rPr>
-          <w:rtl w:val="0"/>
-        </w:rPr>
-        <w:t>Aduna ka’y Canva website</w:t>
+        <w:t>Ang Bio Davao usa ka kasaligan nga fitness hub sukad 2000, dedikado sa kusog, kahimsog, ug komunidad.</w:t>
+      </w:r>
+    </w:p>
+    <w:p>
+      <w:pPr>
+        <w:rPr/>
+      </w:pPr>
+      <w:r>
+        <w:rPr>
+          <w:rtl w:val="0"/>
+        </w:rPr>
+      </w:r>
+    </w:p>
+    <w:p>
+      <w:pPr>
+        <w:rPr/>
+      </w:pPr>
+      <w:r>
+        <w:rPr>
+          <w:rtl w:val="0"/>
+        </w:rPr>
+        <w:t>Kategorya Gym/Sentro sa pisikal nga kahimsog</w:t>
+      </w:r>
+    </w:p>
+    <w:p>
+      <w:pPr>
+        <w:rPr/>
+      </w:pPr>
+      <w:r>
+        <w:rPr>
+          <w:rtl w:val="0"/>
+        </w:rPr>
+      </w:r>
+    </w:p>
+    <w:p>
+      <w:pPr>
+        <w:rPr/>
+      </w:pPr>
+      <w:r>
+        <w:rPr>
+          <w:rtl w:val="0"/>
+        </w:rPr>
+        <w:t>Ang range sa presyo medyo normal.</w:t>
+      </w:r>
+    </w:p>
+    <w:p>
+      <w:pPr>
+        <w:rPr/>
+      </w:pPr>
+      <w:r>
+        <w:rPr>
+          <w:rtl w:val="0"/>
+        </w:rPr>
+      </w:r>
+    </w:p>
+    <w:p>
+      <w:pPr>
+        <w:rPr/>
+      </w:pPr>
+      <w:r>
+        <w:rPr>
+          <w:rtl w:val="0"/>
+        </w:rPr>
+        <w:t>Aduna ka Canva website.</w:t>
       </w:r>
     </w:p>
     <w:p>
@@ -511,49 +509,49 @@
         <w:rPr>
           <w:rtl w:val="0"/>
         </w:rPr>
-        <w:t>gihunahuna nga barato</w:t>
-      </w:r>
-    </w:p>
-    <w:p>
-      <w:pPr>
-        <w:rPr/>
-      </w:pPr>
-      <w:r>
-        <w:rPr>
-          <w:rtl w:val="0"/>
-        </w:rPr>
-      </w:r>
-    </w:p>
-    <w:p>
-      <w:pPr>
-        <w:rPr/>
-      </w:pPr>
-      <w:r>
-        <w:rPr>
-          <w:rtl w:val="0"/>
-        </w:rPr>
-        <w:t>Walay website.</w:t>
-      </w:r>
-    </w:p>
-    <w:p>
-      <w:pPr>
-        <w:rPr/>
-      </w:pPr>
-      <w:r>
-        <w:rPr>
-          <w:rtl w:val="0"/>
-        </w:rPr>
-      </w:r>
-    </w:p>
-    <w:p>
-      <w:pPr>
-        <w:rPr/>
-      </w:pPr>
-      <w:r>
-        <w:rPr>
-          <w:rtl w:val="0"/>
-        </w:rPr>
-        <w:t>Sa kini nga vibe:</w:t>
+        <w:t>Gihunahuna nga barato</w:t>
+      </w:r>
+    </w:p>
+    <w:p>
+      <w:pPr>
+        <w:rPr/>
+      </w:pPr>
+      <w:r>
+        <w:rPr>
+          <w:rtl w:val="0"/>
+        </w:rPr>
+      </w:r>
+    </w:p>
+    <w:p>
+      <w:pPr>
+        <w:rPr/>
+      </w:pPr>
+      <w:r>
+        <w:rPr>
+          <w:rtl w:val="0"/>
+        </w:rPr>
+        <w:t>Walay website</w:t>
+      </w:r>
+    </w:p>
+    <w:p>
+      <w:pPr>
+        <w:rPr/>
+      </w:pPr>
+      <w:r>
+        <w:rPr>
+          <w:rtl w:val="0"/>
+        </w:rPr>
+      </w:r>
+    </w:p>
+    <w:p>
+      <w:pPr>
+        <w:rPr/>
+      </w:pPr>
+      <w:r>
+        <w:rPr>
+          <w:rtl w:val="0"/>
+        </w:rPr>
+        <w:t>Gamit kini isip iyang vibe:</w:t>
       </w:r>
       <w:r>
         <w:rPr/>

</xml_diff>